<commit_message>
Cover letter: fit to one page
Tighter margins (0.8/1.0 in), single line spacing, 4pt paragraph spacing, thin
blank-line gaps. Content and letterhead unchanged.

Co-Authored-By: Claude Opus 4.8 <noreply@anthropic.com>
</commit_message>
<xml_diff>
--- a/paper/Cover_Letter.docx
+++ b/paper/Cover_Letter.docx
@@ -4,6 +4,7 @@
   <w:body>
     <w:p>
       <w:pPr>
+        <w:spacing w:line="240" w:lineRule="auto" w:before="0" w:after="80"/>
         <w:rPr>
           <w:rFonts w:ascii="Times New Roman" w:hAnsi="Times New Roman"/>
           <w:sz w:val="24"/>
@@ -19,6 +20,7 @@
     </w:p>
     <w:p>
       <w:pPr>
+        <w:spacing w:line="240" w:lineRule="auto" w:before="0" w:after="80"/>
         <w:rPr>
           <w:rFonts w:ascii="Times New Roman" w:hAnsi="Times New Roman"/>
           <w:sz w:val="24"/>
@@ -34,6 +36,7 @@
     </w:p>
     <w:p>
       <w:pPr>
+        <w:spacing w:line="240" w:lineRule="auto" w:before="0" w:after="80"/>
         <w:rPr>
           <w:rFonts w:ascii="Times New Roman" w:hAnsi="Times New Roman"/>
           <w:sz w:val="24"/>
@@ -49,6 +52,7 @@
     </w:p>
     <w:p>
       <w:pPr>
+        <w:spacing w:lineRule="exact" w:line="120" w:before="0" w:after="0"/>
         <w:rPr>
           <w:rFonts w:ascii="Times New Roman" w:hAnsi="Times New Roman"/>
           <w:sz w:val="24"/>
@@ -57,6 +61,7 @@
     </w:p>
     <w:p>
       <w:pPr>
+        <w:spacing w:line="240" w:lineRule="auto" w:before="0" w:after="80"/>
         <w:rPr>
           <w:rFonts w:ascii="Times New Roman" w:hAnsi="Times New Roman"/>
           <w:sz w:val="24"/>
@@ -72,6 +77,7 @@
     </w:p>
     <w:p>
       <w:pPr>
+        <w:spacing w:line="240" w:lineRule="auto" w:before="0" w:after="80"/>
         <w:jc w:val="both"/>
         <w:rPr>
           <w:rFonts w:ascii="Times New Roman" w:hAnsi="Times New Roman"/>
@@ -88,6 +94,7 @@
     </w:p>
     <w:p>
       <w:pPr>
+        <w:spacing w:line="240" w:lineRule="auto" w:before="0" w:after="80"/>
         <w:jc w:val="both"/>
         <w:rPr>
           <w:rFonts w:ascii="Times New Roman" w:hAnsi="Times New Roman"/>
@@ -104,6 +111,7 @@
     </w:p>
     <w:p>
       <w:pPr>
+        <w:spacing w:line="240" w:lineRule="auto" w:before="0" w:after="80"/>
         <w:jc w:val="both"/>
         <w:rPr>
           <w:rFonts w:ascii="Times New Roman" w:hAnsi="Times New Roman"/>
@@ -120,6 +128,7 @@
     </w:p>
     <w:p>
       <w:pPr>
+        <w:spacing w:line="240" w:lineRule="auto" w:before="0" w:after="80"/>
         <w:jc w:val="both"/>
         <w:rPr>
           <w:rFonts w:ascii="Times New Roman" w:hAnsi="Times New Roman"/>
@@ -136,6 +145,7 @@
     </w:p>
     <w:p>
       <w:pPr>
+        <w:spacing w:lineRule="exact" w:line="120" w:before="0" w:after="0"/>
         <w:rPr>
           <w:rFonts w:ascii="Times New Roman" w:hAnsi="Times New Roman"/>
           <w:sz w:val="24"/>
@@ -144,6 +154,7 @@
     </w:p>
     <w:p>
       <w:pPr>
+        <w:spacing w:line="240" w:lineRule="auto" w:before="0" w:after="80"/>
         <w:rPr>
           <w:rFonts w:ascii="Times New Roman" w:hAnsi="Times New Roman"/>
           <w:sz w:val="24"/>
@@ -159,6 +170,7 @@
     </w:p>
     <w:p>
       <w:pPr>
+        <w:spacing w:line="240" w:lineRule="auto" w:before="0" w:after="80"/>
         <w:rPr>
           <w:rFonts w:ascii="Times New Roman" w:hAnsi="Times New Roman"/>
           <w:sz w:val="24"/>
@@ -174,6 +186,7 @@
     </w:p>
     <w:p>
       <w:pPr>
+        <w:spacing w:line="240" w:lineRule="auto" w:before="0" w:after="80"/>
         <w:rPr>
           <w:rFonts w:ascii="Times New Roman" w:hAnsi="Times New Roman"/>
           <w:sz w:val="24"/>
@@ -189,6 +202,7 @@
     </w:p>
     <w:p>
       <w:pPr>
+        <w:spacing w:line="240" w:lineRule="auto" w:before="0" w:after="80"/>
         <w:rPr>
           <w:rFonts w:ascii="Times New Roman" w:hAnsi="Times New Roman"/>
           <w:sz w:val="24"/>
@@ -206,7 +220,7 @@
       <w:headerReference w:type="default" r:id="rId8"/>
       <w:footerReference w:type="default" r:id="rId9"/>
       <w:pgSz w:w="12240" w:h="15840"/>
-      <w:pgMar w:top="1440" w:right="1800" w:bottom="1440" w:left="1800" w:header="720" w:footer="720" w:gutter="0"/>
+      <w:pgMar w:top="1152" w:right="1440" w:bottom="1152" w:left="1440" w:header="720" w:footer="720" w:gutter="0"/>
       <w:cols w:space="720"/>
       <w:docGrid w:linePitch="360"/>
     </w:sectPr>

</xml_diff>

<commit_message>
Cover letter: drop ASU lines from the header (Odinzen-only, matches byline)
This Hephaestus paper carries Michael at Odinzen LLC only; the letterhead now reads
name / Odinzen LLC, Houston, TX / email, with the ASU center and department lines
removed. Footer logo and one-page layout unchanged.

Co-Authored-By: Claude Opus 4.8 <noreply@anthropic.com>
</commit_message>
<xml_diff>
--- a/paper/Cover_Letter.docx
+++ b/paper/Cover_Letter.docx
@@ -375,40 +375,6 @@
         <w:szCs w:val="18"/>
       </w:rPr>
       <w:t>Odinzen LLC, Houston, TX, United States</w:t>
-    </w:r>
-  </w:p>
-  <w:p>
-    <w:pPr>
-      <w:spacing w:after="0"/>
-      <w:jc w:val="right"/>
-      <w:rPr>
-        <w:sz w:val="18"/>
-        <w:szCs w:val="18"/>
-      </w:rPr>
-    </w:pPr>
-    <w:r>
-      <w:rPr>
-        <w:sz w:val="18"/>
-        <w:szCs w:val="18"/>
-      </w:rPr>
-      <w:t xml:space="preserve">Navrotsky Eyring Center for Materials of the Universe </w:t>
-    </w:r>
-  </w:p>
-  <w:p>
-    <w:pPr>
-      <w:spacing w:after="0"/>
-      <w:jc w:val="right"/>
-      <w:rPr>
-        <w:sz w:val="18"/>
-        <w:szCs w:val="18"/>
-      </w:rPr>
-    </w:pPr>
-    <w:r>
-      <w:rPr>
-        <w:sz w:val="18"/>
-        <w:szCs w:val="18"/>
-      </w:rPr>
-      <w:t>School of Molecular Sciences, Arizona State University</w:t>
     </w:r>
   </w:p>
   <w:p>

</xml_diff>